<commit_message>
feat: consolidate to Next.js fullstack portal, add dual-cohort switcher, and remove Streamlit
</commit_message>
<xml_diff>
--- a/CardioSense_Complete_Data_Science_Specification.docx
+++ b/CardioSense_Complete_Data_Science_Specification.docx
@@ -7250,7 +7250,7 @@
           <w:color w:val="2D3748"/>
           <w:sz w:val="21"/>
         </w:rPr>
-        <w:t xml:space="preserve">• FastAPI Backend: </w:t>
+        <w:t xml:space="preserve">• FastAPI Backend Service: </w:t>
       </w:r>
       <w:r>
         <w:rPr>
@@ -7319,7 +7319,7 @@
           <w:color w:val="2D3748"/>
           <w:sz w:val="21"/>
         </w:rPr>
-        <w:t xml:space="preserve">• Minimalistic Soft Pastel Streamlit UI: </w:t>
+        <w:t xml:space="preserve">• Full-Stack Next.js 16 Web Portal: </w:t>
       </w:r>
       <w:r>
         <w:rPr>
@@ -7328,30 +7328,7 @@
           <w:color w:val="2D3748"/>
           <w:sz w:val="21"/>
         </w:rPr>
-        <w:t>app/streamlit_app.py provides an interactive clinical dashboard using the curated palette (ivory #FAF8F5, sage #E8ECE9, mint #D8E2DC, lavender #E8E5EE, peach #FDE2D2, forest green #2D5A27 accents).</w:t>
-      </w:r>
-    </w:p>
-    <w:p>
-      <w:pPr>
-        <w:spacing w:after="60" w:line="276" w:lineRule="auto"/>
-      </w:pPr>
-      <w:r>
-        <w:rPr>
-          <w:rFonts w:ascii="Calibri" w:hAnsi="Calibri"/>
-          <w:b/>
-          <w:color w:val="2D3748"/>
-          <w:sz w:val="21"/>
-        </w:rPr>
-        <w:t xml:space="preserve">• Fullstack Next.js Portal: </w:t>
-      </w:r>
-      <w:r>
-        <w:rPr>
-          <w:rFonts w:ascii="Calibri" w:hAnsi="Calibri"/>
-          <w:i w:val="0"/>
-          <w:color w:val="2D3748"/>
-          <w:sz w:val="21"/>
-        </w:rPr>
-        <w:t>frontend/ provides an interactive React research portal showcasing real-time API health, EDA charts, benchmark switchers, and patient simulation.</w:t>
+        <w:t>frontend/ provides an interactive React 19 web portal styled with the soft pastel design system (ivory #FAF8F4, sage #E8ECE9, mint #D8E2DC, lavender #E8E5EE, peach #FDE2D2, forest green #355B4B accents). Features a dual-cohort switcher, live patient risk simulation, benchmark tables, and interactive SHAP lightbox.</w:t>
       </w:r>
     </w:p>
     <w:p>

</xml_diff>